<commit_message>
Se corrige almacenamiento de la tabla venta_inversion
</commit_message>
<xml_diff>
--- a/documentacion/Módulo de Venta de Notas de Crédito.docx
+++ b/documentacion/Módulo de Venta de Notas de Crédito.docx
@@ -2508,6 +2508,1288 @@
       </w:pPr>
       <w:r>
         <w:t>1 solo movimiento bancario real</w:t>
+      </w:r>
+    </w:p>
+    <w:p>
+      <w:pPr>
+        <w:spacing w:after="0" w:line="240" w:lineRule="auto"/>
+      </w:pPr>
+    </w:p>
+    <w:p>
+      <w:pPr>
+        <w:spacing w:after="0" w:line="240" w:lineRule="auto"/>
+      </w:pPr>
+    </w:p>
+    <w:p>
+      <w:pPr>
+        <w:spacing w:after="0" w:line="240" w:lineRule="auto"/>
+      </w:pPr>
+    </w:p>
+    <w:p>
+      <w:pPr>
+        <w:spacing w:after="0" w:line="240" w:lineRule="auto"/>
+      </w:pPr>
+      <w:r>
+        <w:t xml:space="preserve">Cuando se realiza una venta de Notas de Crédito, en la pantalla “Venta Agrupada de Notas de Crédito” </w:t>
+      </w:r>
+      <w:r>
+        <w:t>existe una caja de texto "Porcentaje de Venta”, Normalmente el “Porcentaje de Venta” siempre es 100</w:t>
+      </w:r>
+      <w:r>
+        <w:t xml:space="preserve"> porque se vende la totalidad de la nota de crédito</w:t>
+      </w:r>
+      <w:r>
+        <w:t xml:space="preserve">, debería aparecer </w:t>
+      </w:r>
+      <w:r>
+        <w:t>100</w:t>
+      </w:r>
+      <w:r>
+        <w:t xml:space="preserve"> por defecto. </w:t>
+      </w:r>
+    </w:p>
+    <w:p>
+      <w:pPr>
+        <w:spacing w:after="0" w:line="240" w:lineRule="auto"/>
+      </w:pPr>
+      <w:r>
+        <w:t>Necesitamos otro campo llamado "Precio"</w:t>
+      </w:r>
+      <w:r>
+        <w:t xml:space="preserve"> </w:t>
+      </w:r>
+      <w:r>
+        <w:t xml:space="preserve">la otra opción es reemplazar “Porcentaje de Venta” por “Precio” </w:t>
+      </w:r>
+      <w:r>
+        <w:t xml:space="preserve">porque es el precio el que puede cambiar, casi nunca se vende al 100% del valor nominal, lo normal es que una Nota de crédito se negocie al 98% o 99% del valor nominal, el usuario debe poder digitar ese valor, por lo </w:t>
+      </w:r>
+      <w:proofErr w:type="gramStart"/>
+      <w:r>
+        <w:t>tanto</w:t>
+      </w:r>
+      <w:proofErr w:type="gramEnd"/>
+      <w:r>
+        <w:t xml:space="preserve"> el “Valor Efectivo” se debe calcular como el “Precio” multiplicado por el “Valor Nominal”</w:t>
+      </w:r>
+    </w:p>
+    <w:p>
+      <w:pPr>
+        <w:spacing w:after="0" w:line="240" w:lineRule="auto"/>
+      </w:pPr>
+      <w:r>
+        <w:t xml:space="preserve">En esta pantalla se digita también la comisión del operador </w:t>
+      </w:r>
+      <w:r>
+        <w:t>y la comisión de la bolsa.</w:t>
+      </w:r>
+    </w:p>
+    <w:p>
+      <w:pPr>
+        <w:spacing w:after="0" w:line="240" w:lineRule="auto"/>
+      </w:pPr>
+      <w:r>
+        <w:t>El Valor Total Recibido sería igual al Valor Efectivo menos el valor de las comisiones.</w:t>
+      </w:r>
+    </w:p>
+    <w:p>
+      <w:pPr>
+        <w:spacing w:after="0" w:line="240" w:lineRule="auto"/>
+      </w:pPr>
+      <w:r>
+        <w:t>Debería mostrarse también el “</w:t>
+      </w:r>
+      <w:r>
+        <w:t>Precio</w:t>
+      </w:r>
+      <w:r>
+        <w:t xml:space="preserve"> Neto” que sería el “Valor Total Recibido” dividido para el “Valor Nominal”</w:t>
+      </w:r>
+    </w:p>
+    <w:p>
+      <w:pPr>
+        <w:spacing w:after="0" w:line="240" w:lineRule="auto"/>
+      </w:pPr>
+    </w:p>
+    <w:p>
+      <w:pPr>
+        <w:spacing w:after="0" w:line="240" w:lineRule="auto"/>
+      </w:pPr>
+      <w:r>
+        <w:t xml:space="preserve">Analiza paso a paso la imagen adjunta </w:t>
+      </w:r>
+    </w:p>
+    <w:p>
+      <w:pPr>
+        <w:spacing w:after="0" w:line="240" w:lineRule="auto"/>
+      </w:pPr>
+      <w:r>
+        <w:rPr>
+          <w:noProof/>
+        </w:rPr>
+        <w:drawing>
+          <wp:inline distT="0" distB="0" distL="0" distR="0" wp14:anchorId="6078A8C5" wp14:editId="1FC15EDB">
+            <wp:extent cx="5400040" cy="4295140"/>
+            <wp:effectExtent l="0" t="0" r="0" b="0"/>
+            <wp:docPr id="2128431809" name="Imagen 1"/>
+            <wp:cNvGraphicFramePr>
+              <a:graphicFrameLocks xmlns:a="http://schemas.openxmlformats.org/drawingml/2006/main" noChangeAspect="1"/>
+            </wp:cNvGraphicFramePr>
+            <a:graphic xmlns:a="http://schemas.openxmlformats.org/drawingml/2006/main">
+              <a:graphicData uri="http://schemas.openxmlformats.org/drawingml/2006/picture">
+                <pic:pic xmlns:pic="http://schemas.openxmlformats.org/drawingml/2006/picture">
+                  <pic:nvPicPr>
+                    <pic:cNvPr id="2128431809" name=""/>
+                    <pic:cNvPicPr/>
+                  </pic:nvPicPr>
+                  <pic:blipFill>
+                    <a:blip r:embed="rId5"/>
+                    <a:stretch>
+                      <a:fillRect/>
+                    </a:stretch>
+                  </pic:blipFill>
+                  <pic:spPr>
+                    <a:xfrm>
+                      <a:off x="0" y="0"/>
+                      <a:ext cx="5400040" cy="4295140"/>
+                    </a:xfrm>
+                    <a:prstGeom prst="rect">
+                      <a:avLst/>
+                    </a:prstGeom>
+                  </pic:spPr>
+                </pic:pic>
+              </a:graphicData>
+            </a:graphic>
+          </wp:inline>
+        </w:drawing>
+      </w:r>
+    </w:p>
+    <w:p>
+      <w:pPr>
+        <w:spacing w:after="0" w:line="240" w:lineRule="auto"/>
+      </w:pPr>
+    </w:p>
+    <w:p>
+      <w:pPr>
+        <w:spacing w:after="0" w:line="240" w:lineRule="auto"/>
+      </w:pPr>
+      <w:r>
+        <w:t>Cuando se hace clic en previsualizar aparece esta otra pantalla:</w:t>
+      </w:r>
+    </w:p>
+    <w:p>
+      <w:pPr>
+        <w:spacing w:after="0" w:line="240" w:lineRule="auto"/>
+      </w:pPr>
+      <w:r>
+        <w:rPr>
+          <w:noProof/>
+        </w:rPr>
+        <w:lastRenderedPageBreak/>
+        <w:drawing>
+          <wp:inline distT="0" distB="0" distL="0" distR="0" wp14:anchorId="4D086EB3" wp14:editId="0558D7C2">
+            <wp:extent cx="5400040" cy="2988945"/>
+            <wp:effectExtent l="0" t="0" r="0" b="1905"/>
+            <wp:docPr id="237847644" name="Imagen 1"/>
+            <wp:cNvGraphicFramePr>
+              <a:graphicFrameLocks xmlns:a="http://schemas.openxmlformats.org/drawingml/2006/main" noChangeAspect="1"/>
+            </wp:cNvGraphicFramePr>
+            <a:graphic xmlns:a="http://schemas.openxmlformats.org/drawingml/2006/main">
+              <a:graphicData uri="http://schemas.openxmlformats.org/drawingml/2006/picture">
+                <pic:pic xmlns:pic="http://schemas.openxmlformats.org/drawingml/2006/picture">
+                  <pic:nvPicPr>
+                    <pic:cNvPr id="237847644" name=""/>
+                    <pic:cNvPicPr/>
+                  </pic:nvPicPr>
+                  <pic:blipFill>
+                    <a:blip r:embed="rId6"/>
+                    <a:stretch>
+                      <a:fillRect/>
+                    </a:stretch>
+                  </pic:blipFill>
+                  <pic:spPr>
+                    <a:xfrm>
+                      <a:off x="0" y="0"/>
+                      <a:ext cx="5400040" cy="2988945"/>
+                    </a:xfrm>
+                    <a:prstGeom prst="rect">
+                      <a:avLst/>
+                    </a:prstGeom>
+                  </pic:spPr>
+                </pic:pic>
+              </a:graphicData>
+            </a:graphic>
+          </wp:inline>
+        </w:drawing>
+      </w:r>
+    </w:p>
+    <w:p>
+      <w:pPr>
+        <w:spacing w:after="0" w:line="240" w:lineRule="auto"/>
+      </w:pPr>
+    </w:p>
+    <w:p>
+      <w:pPr>
+        <w:spacing w:after="0" w:line="240" w:lineRule="auto"/>
+      </w:pPr>
+      <w:r>
+        <w:t>Cuando se hace clic en “Confirmar Venta”</w:t>
+      </w:r>
+    </w:p>
+    <w:p>
+      <w:pPr>
+        <w:spacing w:after="0" w:line="240" w:lineRule="auto"/>
+      </w:pPr>
+      <w:r>
+        <w:t xml:space="preserve">Debe guardar apropiadamente un registro en la tabla </w:t>
+      </w:r>
+      <w:proofErr w:type="spellStart"/>
+      <w:r>
+        <w:t>venta_inversion</w:t>
+      </w:r>
+      <w:proofErr w:type="spellEnd"/>
+      <w:r>
+        <w:t xml:space="preserve"> tomando en cuenta la siguiente información:</w:t>
+      </w:r>
+    </w:p>
+    <w:p>
+      <w:pPr>
+        <w:spacing w:after="0" w:line="240" w:lineRule="auto"/>
+      </w:pPr>
+    </w:p>
+    <w:p>
+      <w:pPr>
+        <w:spacing w:after="0" w:line="240" w:lineRule="auto"/>
+      </w:pPr>
+    </w:p>
+    <w:p>
+      <w:pPr>
+        <w:spacing w:after="0" w:line="240" w:lineRule="auto"/>
+      </w:pPr>
+      <w:r>
+        <w:t>INSERT INTO `sipro_</w:t>
+      </w:r>
+      <w:proofErr w:type="spellStart"/>
+      <w:r>
+        <w:t>desa</w:t>
+      </w:r>
+      <w:proofErr w:type="spellEnd"/>
+      <w:proofErr w:type="gramStart"/>
+      <w:r>
+        <w:t>`.`</w:t>
+      </w:r>
+      <w:proofErr w:type="spellStart"/>
+      <w:proofErr w:type="gramEnd"/>
+      <w:r>
+        <w:t>venta_inversion</w:t>
+      </w:r>
+      <w:proofErr w:type="spellEnd"/>
+      <w:r>
+        <w:t>`</w:t>
+      </w:r>
+    </w:p>
+    <w:p>
+      <w:pPr>
+        <w:spacing w:after="0" w:line="240" w:lineRule="auto"/>
+      </w:pPr>
+      <w:r>
+        <w:t>(`</w:t>
+      </w:r>
+      <w:proofErr w:type="spellStart"/>
+      <w:r>
+        <w:t>id_venta_inversion</w:t>
+      </w:r>
+      <w:proofErr w:type="spellEnd"/>
+      <w:r>
+        <w:t>`,</w:t>
+      </w:r>
+    </w:p>
+    <w:p>
+      <w:pPr>
+        <w:spacing w:after="0" w:line="240" w:lineRule="auto"/>
+      </w:pPr>
+      <w:r>
+        <w:t>`</w:t>
+      </w:r>
+      <w:proofErr w:type="spellStart"/>
+      <w:r>
+        <w:t>id_inversion</w:t>
+      </w:r>
+      <w:proofErr w:type="spellEnd"/>
+      <w:r>
+        <w:t>`,</w:t>
+      </w:r>
+    </w:p>
+    <w:p>
+      <w:pPr>
+        <w:spacing w:after="0" w:line="240" w:lineRule="auto"/>
+      </w:pPr>
+      <w:r>
+        <w:t>`</w:t>
+      </w:r>
+      <w:proofErr w:type="spellStart"/>
+      <w:r>
+        <w:t>id_instrumento</w:t>
+      </w:r>
+      <w:proofErr w:type="spellEnd"/>
+      <w:r>
+        <w:t>`,</w:t>
+      </w:r>
+    </w:p>
+    <w:p>
+      <w:pPr>
+        <w:spacing w:after="0" w:line="240" w:lineRule="auto"/>
+      </w:pPr>
+      <w:r>
+        <w:t>`</w:t>
+      </w:r>
+      <w:proofErr w:type="spellStart"/>
+      <w:r>
+        <w:t>id_tipo_venta</w:t>
+      </w:r>
+      <w:proofErr w:type="spellEnd"/>
+      <w:r>
+        <w:t>`,</w:t>
+      </w:r>
+    </w:p>
+    <w:p>
+      <w:pPr>
+        <w:spacing w:after="0" w:line="240" w:lineRule="auto"/>
+      </w:pPr>
+      <w:r>
+        <w:t>`</w:t>
+      </w:r>
+      <w:proofErr w:type="spellStart"/>
+      <w:r>
+        <w:t>id_propietario</w:t>
+      </w:r>
+      <w:proofErr w:type="spellEnd"/>
+      <w:r>
+        <w:t>`,</w:t>
+      </w:r>
+    </w:p>
+    <w:p>
+      <w:pPr>
+        <w:spacing w:after="0" w:line="240" w:lineRule="auto"/>
+      </w:pPr>
+      <w:r>
+        <w:t>`</w:t>
+      </w:r>
+      <w:proofErr w:type="spellStart"/>
+      <w:r>
+        <w:t>porcentaje_vendido</w:t>
+      </w:r>
+      <w:proofErr w:type="spellEnd"/>
+      <w:r>
+        <w:t>`,</w:t>
+      </w:r>
+    </w:p>
+    <w:p>
+      <w:pPr>
+        <w:spacing w:after="0" w:line="240" w:lineRule="auto"/>
+      </w:pPr>
+      <w:r>
+        <w:t>`</w:t>
+      </w:r>
+      <w:proofErr w:type="spellStart"/>
+      <w:r>
+        <w:t>fecha_venta</w:t>
+      </w:r>
+      <w:proofErr w:type="spellEnd"/>
+      <w:r>
+        <w:t>`,</w:t>
+      </w:r>
+    </w:p>
+    <w:p>
+      <w:pPr>
+        <w:spacing w:after="0" w:line="240" w:lineRule="auto"/>
+      </w:pPr>
+      <w:r>
+        <w:t>`</w:t>
+      </w:r>
+      <w:proofErr w:type="spellStart"/>
+      <w:r>
+        <w:t>liquidacion_venta</w:t>
+      </w:r>
+      <w:proofErr w:type="spellEnd"/>
+      <w:r>
+        <w:t>`,</w:t>
+      </w:r>
+    </w:p>
+    <w:p>
+      <w:pPr>
+        <w:spacing w:after="0" w:line="240" w:lineRule="auto"/>
+      </w:pPr>
+      <w:r>
+        <w:t>`</w:t>
+      </w:r>
+      <w:proofErr w:type="spellStart"/>
+      <w:r>
+        <w:t>precio_venta</w:t>
+      </w:r>
+      <w:proofErr w:type="spellEnd"/>
+      <w:r>
+        <w:t>`,</w:t>
+      </w:r>
+    </w:p>
+    <w:p>
+      <w:pPr>
+        <w:spacing w:after="0" w:line="240" w:lineRule="auto"/>
+      </w:pPr>
+      <w:r>
+        <w:t>`</w:t>
+      </w:r>
+      <w:proofErr w:type="spellStart"/>
+      <w:r>
+        <w:t>precio_neto_venta</w:t>
+      </w:r>
+      <w:proofErr w:type="spellEnd"/>
+      <w:r>
+        <w:t>`,</w:t>
+      </w:r>
+    </w:p>
+    <w:p>
+      <w:pPr>
+        <w:spacing w:after="0" w:line="240" w:lineRule="auto"/>
+      </w:pPr>
+      <w:r>
+        <w:t>`</w:t>
+      </w:r>
+      <w:proofErr w:type="spellStart"/>
+      <w:r>
+        <w:t>interes_previo_venta</w:t>
+      </w:r>
+      <w:proofErr w:type="spellEnd"/>
+      <w:r>
+        <w:t>`,</w:t>
+      </w:r>
+    </w:p>
+    <w:p>
+      <w:pPr>
+        <w:spacing w:after="0" w:line="240" w:lineRule="auto"/>
+      </w:pPr>
+      <w:r>
+        <w:t>`</w:t>
+      </w:r>
+      <w:proofErr w:type="spellStart"/>
+      <w:r>
+        <w:t>valor_venta_sin_comision</w:t>
+      </w:r>
+      <w:proofErr w:type="spellEnd"/>
+      <w:r>
+        <w:t>`,</w:t>
+      </w:r>
+    </w:p>
+    <w:p>
+      <w:pPr>
+        <w:spacing w:after="0" w:line="240" w:lineRule="auto"/>
+      </w:pPr>
+      <w:r>
+        <w:t>`</w:t>
+      </w:r>
+      <w:proofErr w:type="spellStart"/>
+      <w:r>
+        <w:t>comision_operador</w:t>
+      </w:r>
+      <w:proofErr w:type="spellEnd"/>
+      <w:r>
+        <w:t>`,</w:t>
+      </w:r>
+    </w:p>
+    <w:p>
+      <w:pPr>
+        <w:spacing w:after="0" w:line="240" w:lineRule="auto"/>
+      </w:pPr>
+      <w:r>
+        <w:t>`</w:t>
+      </w:r>
+      <w:proofErr w:type="spellStart"/>
+      <w:r>
+        <w:t>comision_bolsa</w:t>
+      </w:r>
+      <w:proofErr w:type="spellEnd"/>
+      <w:r>
+        <w:t>`,</w:t>
+      </w:r>
+    </w:p>
+    <w:p>
+      <w:pPr>
+        <w:spacing w:after="0" w:line="240" w:lineRule="auto"/>
+      </w:pPr>
+      <w:r>
+        <w:t>`</w:t>
+      </w:r>
+      <w:proofErr w:type="spellStart"/>
+      <w:r>
+        <w:t>valor_venta_con_comision</w:t>
+      </w:r>
+      <w:proofErr w:type="spellEnd"/>
+      <w:r>
+        <w:t>`,</w:t>
+      </w:r>
+    </w:p>
+    <w:p>
+      <w:pPr>
+        <w:spacing w:after="0" w:line="240" w:lineRule="auto"/>
+      </w:pPr>
+      <w:r>
+        <w:t>`</w:t>
+      </w:r>
+      <w:proofErr w:type="spellStart"/>
+      <w:r>
+        <w:t>utilidad_sin_comision</w:t>
+      </w:r>
+      <w:proofErr w:type="spellEnd"/>
+      <w:r>
+        <w:t>`,</w:t>
+      </w:r>
+    </w:p>
+    <w:p>
+      <w:pPr>
+        <w:spacing w:after="0" w:line="240" w:lineRule="auto"/>
+      </w:pPr>
+      <w:r>
+        <w:t>`</w:t>
+      </w:r>
+      <w:proofErr w:type="spellStart"/>
+      <w:r>
+        <w:t>utilidad_con_comision</w:t>
+      </w:r>
+      <w:proofErr w:type="spellEnd"/>
+      <w:r>
+        <w:t>`,</w:t>
+      </w:r>
+    </w:p>
+    <w:p>
+      <w:pPr>
+        <w:spacing w:after="0" w:line="240" w:lineRule="auto"/>
+      </w:pPr>
+      <w:r>
+        <w:t>`</w:t>
+      </w:r>
+      <w:proofErr w:type="spellStart"/>
+      <w:r>
+        <w:t>ganancia_perdida</w:t>
+      </w:r>
+      <w:proofErr w:type="spellEnd"/>
+      <w:r>
+        <w:t>`,</w:t>
+      </w:r>
+    </w:p>
+    <w:p>
+      <w:pPr>
+        <w:spacing w:after="0" w:line="240" w:lineRule="auto"/>
+      </w:pPr>
+      <w:r>
+        <w:t>`</w:t>
+      </w:r>
+      <w:proofErr w:type="spellStart"/>
+      <w:r>
+        <w:t>rendimiento_total</w:t>
+      </w:r>
+      <w:proofErr w:type="spellEnd"/>
+      <w:r>
+        <w:t>`,</w:t>
+      </w:r>
+    </w:p>
+    <w:p>
+      <w:pPr>
+        <w:spacing w:after="0" w:line="240" w:lineRule="auto"/>
+      </w:pPr>
+      <w:r>
+        <w:t>`</w:t>
+      </w:r>
+      <w:proofErr w:type="spellStart"/>
+      <w:r>
+        <w:t>dias_transcurridos</w:t>
+      </w:r>
+      <w:proofErr w:type="spellEnd"/>
+      <w:r>
+        <w:t>`,</w:t>
+      </w:r>
+    </w:p>
+    <w:p>
+      <w:pPr>
+        <w:spacing w:after="0" w:line="240" w:lineRule="auto"/>
+      </w:pPr>
+      <w:r>
+        <w:t>`</w:t>
+      </w:r>
+      <w:proofErr w:type="spellStart"/>
+      <w:r>
+        <w:t>roi</w:t>
+      </w:r>
+      <w:proofErr w:type="spellEnd"/>
+      <w:r>
+        <w:t>`,</w:t>
+      </w:r>
+    </w:p>
+    <w:p>
+      <w:pPr>
+        <w:spacing w:after="0" w:line="240" w:lineRule="auto"/>
+      </w:pPr>
+      <w:r>
+        <w:t>`</w:t>
+      </w:r>
+      <w:proofErr w:type="spellStart"/>
+      <w:r>
+        <w:t>ganancia_anual</w:t>
+      </w:r>
+      <w:proofErr w:type="spellEnd"/>
+      <w:r>
+        <w:t>`,</w:t>
+      </w:r>
+    </w:p>
+    <w:p>
+      <w:pPr>
+        <w:spacing w:after="0" w:line="240" w:lineRule="auto"/>
+      </w:pPr>
+      <w:r>
+        <w:t>`</w:t>
+      </w:r>
+      <w:proofErr w:type="spellStart"/>
+      <w:r>
+        <w:t>comisiones_santa_fe</w:t>
+      </w:r>
+      <w:proofErr w:type="spellEnd"/>
+      <w:r>
+        <w:t>`,</w:t>
+      </w:r>
+    </w:p>
+    <w:p>
+      <w:pPr>
+        <w:spacing w:after="0" w:line="240" w:lineRule="auto"/>
+      </w:pPr>
+      <w:r>
+        <w:t>`retenciones`,</w:t>
+      </w:r>
+    </w:p>
+    <w:p>
+      <w:pPr>
+        <w:spacing w:after="0" w:line="240" w:lineRule="auto"/>
+      </w:pPr>
+      <w:r>
+        <w:t>`</w:t>
+      </w:r>
+      <w:proofErr w:type="spellStart"/>
+      <w:r>
+        <w:t>observacion</w:t>
+      </w:r>
+      <w:proofErr w:type="spellEnd"/>
+      <w:r>
+        <w:t>`,</w:t>
+      </w:r>
+    </w:p>
+    <w:p>
+      <w:pPr>
+        <w:spacing w:after="0" w:line="240" w:lineRule="auto"/>
+      </w:pPr>
+      <w:r>
+        <w:t>`activo`,</w:t>
+      </w:r>
+    </w:p>
+    <w:p>
+      <w:pPr>
+        <w:spacing w:after="0" w:line="240" w:lineRule="auto"/>
+      </w:pPr>
+      <w:r>
+        <w:t>`eliminado`,</w:t>
+      </w:r>
+    </w:p>
+    <w:p>
+      <w:pPr>
+        <w:spacing w:after="0" w:line="240" w:lineRule="auto"/>
+      </w:pPr>
+      <w:r>
+        <w:lastRenderedPageBreak/>
+        <w:t>`</w:t>
+      </w:r>
+      <w:proofErr w:type="spellStart"/>
+      <w:r>
+        <w:t>fecha_creacion</w:t>
+      </w:r>
+      <w:proofErr w:type="spellEnd"/>
+      <w:r>
+        <w:t>`,</w:t>
+      </w:r>
+    </w:p>
+    <w:p>
+      <w:pPr>
+        <w:spacing w:after="0" w:line="240" w:lineRule="auto"/>
+      </w:pPr>
+      <w:r>
+        <w:t>`</w:t>
+      </w:r>
+      <w:proofErr w:type="spellStart"/>
+      <w:r>
+        <w:t>fecha_actualizacion</w:t>
+      </w:r>
+      <w:proofErr w:type="spellEnd"/>
+      <w:r>
+        <w:t>`)</w:t>
+      </w:r>
+    </w:p>
+    <w:p>
+      <w:pPr>
+        <w:spacing w:after="0" w:line="240" w:lineRule="auto"/>
+      </w:pPr>
+      <w:r>
+        <w:t>VALUES</w:t>
+      </w:r>
+    </w:p>
+    <w:p>
+      <w:pPr>
+        <w:spacing w:after="0" w:line="240" w:lineRule="auto"/>
+      </w:pPr>
+      <w:r>
+        <w:t>(</w:t>
+      </w:r>
+      <w:proofErr w:type="gramStart"/>
+      <w:r>
+        <w:t>&lt;{</w:t>
+      </w:r>
+      <w:proofErr w:type="spellStart"/>
+      <w:proofErr w:type="gramEnd"/>
+      <w:r>
+        <w:t>id_venta_inversion</w:t>
+      </w:r>
+      <w:proofErr w:type="spellEnd"/>
+      <w:r>
+        <w:t>: }&gt;, #id propio de la tabla</w:t>
+      </w:r>
+    </w:p>
+    <w:p>
+      <w:pPr>
+        <w:spacing w:after="0" w:line="240" w:lineRule="auto"/>
+        <w:rPr>
+          <w:lang w:val="en-US"/>
+        </w:rPr>
+      </w:pPr>
+      <w:r>
+        <w:rPr>
+          <w:lang w:val="en-US"/>
+        </w:rPr>
+        <w:t>&lt;{id_inversion: }&gt;, #NULL</w:t>
+      </w:r>
+    </w:p>
+    <w:p>
+      <w:pPr>
+        <w:spacing w:after="0" w:line="240" w:lineRule="auto"/>
+        <w:rPr>
+          <w:lang w:val="en-US"/>
+        </w:rPr>
+      </w:pPr>
+      <w:r>
+        <w:rPr>
+          <w:lang w:val="en-US"/>
+        </w:rPr>
+        <w:t xml:space="preserve">&lt;{id_instrumento: }&gt;, #222 </w:t>
+      </w:r>
+    </w:p>
+    <w:p>
+      <w:pPr>
+        <w:spacing w:after="0" w:line="240" w:lineRule="auto"/>
+      </w:pPr>
+      <w:proofErr w:type="gramStart"/>
+      <w:r>
+        <w:t>&lt;{</w:t>
+      </w:r>
+      <w:proofErr w:type="spellStart"/>
+      <w:proofErr w:type="gramEnd"/>
+      <w:r>
+        <w:t>id_tipo_venta</w:t>
+      </w:r>
+      <w:proofErr w:type="spellEnd"/>
+      <w:r>
+        <w:t>: }&gt;, #195</w:t>
+      </w:r>
+    </w:p>
+    <w:p>
+      <w:pPr>
+        <w:spacing w:after="0" w:line="240" w:lineRule="auto"/>
+      </w:pPr>
+      <w:proofErr w:type="gramStart"/>
+      <w:r>
+        <w:t>&lt;{</w:t>
+      </w:r>
+      <w:proofErr w:type="spellStart"/>
+      <w:proofErr w:type="gramEnd"/>
+      <w:r>
+        <w:t>id_propietario</w:t>
+      </w:r>
+      <w:proofErr w:type="spellEnd"/>
+      <w:r>
+        <w:t xml:space="preserve">: }&gt;, #El propietario de las notas de </w:t>
+      </w:r>
+      <w:proofErr w:type="spellStart"/>
+      <w:r>
+        <w:t>credito</w:t>
+      </w:r>
+      <w:proofErr w:type="spellEnd"/>
+      <w:r>
+        <w:t xml:space="preserve"> vendidas</w:t>
+      </w:r>
+    </w:p>
+    <w:p>
+      <w:pPr>
+        <w:spacing w:after="0" w:line="240" w:lineRule="auto"/>
+      </w:pPr>
+      <w:proofErr w:type="gramStart"/>
+      <w:r>
+        <w:t>&lt;{</w:t>
+      </w:r>
+      <w:proofErr w:type="spellStart"/>
+      <w:proofErr w:type="gramEnd"/>
+      <w:r>
+        <w:t>porcentaje_vendido</w:t>
+      </w:r>
+      <w:proofErr w:type="spellEnd"/>
+      <w:r>
+        <w:t>: 0.00}&gt;, #100</w:t>
+      </w:r>
+    </w:p>
+    <w:p>
+      <w:pPr>
+        <w:spacing w:after="0" w:line="240" w:lineRule="auto"/>
+      </w:pPr>
+      <w:proofErr w:type="gramStart"/>
+      <w:r>
+        <w:t>&lt;{</w:t>
+      </w:r>
+      <w:proofErr w:type="spellStart"/>
+      <w:proofErr w:type="gramEnd"/>
+      <w:r>
+        <w:t>fecha_venta</w:t>
+      </w:r>
+      <w:proofErr w:type="spellEnd"/>
+      <w:r>
+        <w:t>: }&gt;, #Fecha Actual</w:t>
+      </w:r>
+    </w:p>
+    <w:p>
+      <w:pPr>
+        <w:spacing w:after="0" w:line="240" w:lineRule="auto"/>
+      </w:pPr>
+      <w:proofErr w:type="gramStart"/>
+      <w:r>
+        <w:t>&lt;{</w:t>
+      </w:r>
+      <w:proofErr w:type="spellStart"/>
+      <w:proofErr w:type="gramEnd"/>
+      <w:r>
+        <w:t>liquidacion_venta</w:t>
+      </w:r>
+      <w:proofErr w:type="spellEnd"/>
+      <w:r>
+        <w:t>: }&gt;, #Liquidacion ingresada en la pantalla "Venta Agrupada de Notas de Crédito”</w:t>
+      </w:r>
+    </w:p>
+    <w:p>
+      <w:pPr>
+        <w:spacing w:after="0" w:line="240" w:lineRule="auto"/>
+      </w:pPr>
+      <w:proofErr w:type="gramStart"/>
+      <w:r>
+        <w:t>&lt;{</w:t>
+      </w:r>
+      <w:proofErr w:type="spellStart"/>
+      <w:proofErr w:type="gramEnd"/>
+      <w:r>
+        <w:t>precio_venta</w:t>
+      </w:r>
+      <w:proofErr w:type="spellEnd"/>
+      <w:r>
+        <w:t>: 0.00000000}&gt;, #“Precio” ingresada en la pantalla "Venta Agrupada de Notas de Crédito”</w:t>
+      </w:r>
+    </w:p>
+    <w:p>
+      <w:pPr>
+        <w:spacing w:after="0" w:line="240" w:lineRule="auto"/>
+      </w:pPr>
+      <w:proofErr w:type="gramStart"/>
+      <w:r>
+        <w:t>&lt;{</w:t>
+      </w:r>
+      <w:proofErr w:type="spellStart"/>
+      <w:proofErr w:type="gramEnd"/>
+      <w:r>
+        <w:t>precio_neto_venta</w:t>
+      </w:r>
+      <w:proofErr w:type="spellEnd"/>
+      <w:r>
+        <w:t>: 0.00000000}&gt;, #“Precio neto” ingresada en la pantalla "Venta Agrupada de Notas de Crédito”</w:t>
+      </w:r>
+    </w:p>
+    <w:p>
+      <w:pPr>
+        <w:spacing w:after="0" w:line="240" w:lineRule="auto"/>
+      </w:pPr>
+      <w:proofErr w:type="gramStart"/>
+      <w:r>
+        <w:t>&lt;{</w:t>
+      </w:r>
+      <w:proofErr w:type="spellStart"/>
+      <w:proofErr w:type="gramEnd"/>
+      <w:r>
+        <w:t>interes_previo_venta</w:t>
+      </w:r>
+      <w:proofErr w:type="spellEnd"/>
+      <w:r>
+        <w:t>: 0.00}&gt;, #0</w:t>
+      </w:r>
+    </w:p>
+    <w:p>
+      <w:pPr>
+        <w:spacing w:after="0" w:line="240" w:lineRule="auto"/>
+      </w:pPr>
+      <w:proofErr w:type="gramStart"/>
+      <w:r>
+        <w:t>&lt;{</w:t>
+      </w:r>
+      <w:proofErr w:type="spellStart"/>
+      <w:proofErr w:type="gramEnd"/>
+      <w:r>
+        <w:t>valor_venta_sin_comision</w:t>
+      </w:r>
+      <w:proofErr w:type="spellEnd"/>
+      <w:r>
+        <w:t>: 0.00}&gt;, #Valor Efectivo ingresada en la pantalla "Venta Agrupada de Notas de Crédito”</w:t>
+      </w:r>
+    </w:p>
+    <w:p>
+      <w:pPr>
+        <w:spacing w:after="0" w:line="240" w:lineRule="auto"/>
+      </w:pPr>
+      <w:proofErr w:type="gramStart"/>
+      <w:r>
+        <w:t>&lt;{</w:t>
+      </w:r>
+      <w:proofErr w:type="spellStart"/>
+      <w:proofErr w:type="gramEnd"/>
+      <w:r>
+        <w:t>comision_operador</w:t>
+      </w:r>
+      <w:proofErr w:type="spellEnd"/>
+      <w:r>
+        <w:t>: 0.00}&gt;, #comision_operador ingresada en la pantalla "Venta Agrupada de Notas de Crédito”</w:t>
+      </w:r>
+    </w:p>
+    <w:p>
+      <w:pPr>
+        <w:spacing w:after="0" w:line="240" w:lineRule="auto"/>
+      </w:pPr>
+      <w:proofErr w:type="gramStart"/>
+      <w:r>
+        <w:t>&lt;{</w:t>
+      </w:r>
+      <w:proofErr w:type="spellStart"/>
+      <w:proofErr w:type="gramEnd"/>
+      <w:r>
+        <w:t>comision_bolsa</w:t>
+      </w:r>
+      <w:proofErr w:type="spellEnd"/>
+      <w:r>
+        <w:t>: 0.00}&gt;, #comision bolsa ingresada en la pantalla "Venta Agrupada de Notas de Crédito”</w:t>
+      </w:r>
+    </w:p>
+    <w:p>
+      <w:pPr>
+        <w:spacing w:after="0" w:line="240" w:lineRule="auto"/>
+      </w:pPr>
+      <w:proofErr w:type="gramStart"/>
+      <w:r>
+        <w:t>&lt;{</w:t>
+      </w:r>
+      <w:proofErr w:type="spellStart"/>
+      <w:proofErr w:type="gramEnd"/>
+      <w:r>
+        <w:t>valor_venta_con_comision</w:t>
+      </w:r>
+      <w:proofErr w:type="spellEnd"/>
+      <w:r>
+        <w:t>: 0.00}&gt;, #Valor total recibido calculado en la pantalla "Venta Agrupada de Notas de Crédito”</w:t>
+      </w:r>
+    </w:p>
+    <w:p>
+      <w:pPr>
+        <w:spacing w:after="0" w:line="240" w:lineRule="auto"/>
+      </w:pPr>
+      <w:proofErr w:type="gramStart"/>
+      <w:r>
+        <w:t>&lt;{</w:t>
+      </w:r>
+      <w:proofErr w:type="spellStart"/>
+      <w:proofErr w:type="gramEnd"/>
+      <w:r>
+        <w:t>utilidad_sin_comision</w:t>
+      </w:r>
+      <w:proofErr w:type="spellEnd"/>
+      <w:r>
+        <w:t>: 0.00}&gt;, # Valor Efectivo - Capital invertido  -los dos valores aparecen en la pantalla "Venta Agrupada de Notas de Crédito”</w:t>
+      </w:r>
+    </w:p>
+    <w:p>
+      <w:pPr>
+        <w:spacing w:after="0" w:line="240" w:lineRule="auto"/>
+      </w:pPr>
+      <w:proofErr w:type="gramStart"/>
+      <w:r>
+        <w:t>&lt;{</w:t>
+      </w:r>
+      <w:proofErr w:type="spellStart"/>
+      <w:proofErr w:type="gramEnd"/>
+      <w:r>
+        <w:t>utilidad_con_comision</w:t>
+      </w:r>
+      <w:proofErr w:type="spellEnd"/>
+      <w:r>
+        <w:t>: 0.00}&gt;, # Valor Total Recibido - Capital invertido -los dos valores aparecen en la pantalla "Venta Agrupada de Notas de Crédito”</w:t>
+      </w:r>
+    </w:p>
+    <w:p>
+      <w:pPr>
+        <w:spacing w:after="0" w:line="240" w:lineRule="auto"/>
+      </w:pPr>
+      <w:proofErr w:type="gramStart"/>
+      <w:r>
+        <w:t>&lt;{</w:t>
+      </w:r>
+      <w:proofErr w:type="spellStart"/>
+      <w:proofErr w:type="gramEnd"/>
+      <w:r>
+        <w:t>ganancia_perdida</w:t>
+      </w:r>
+      <w:proofErr w:type="spellEnd"/>
+      <w:r>
+        <w:t>: 0.00}&gt;, # Valor Total Recibido - Capital invertido -los dos valores aparecen en la pantalla "Venta Agrupada de Notas de Crédito”</w:t>
+      </w:r>
+    </w:p>
+    <w:p>
+      <w:pPr>
+        <w:spacing w:after="0" w:line="240" w:lineRule="auto"/>
+      </w:pPr>
+      <w:proofErr w:type="gramStart"/>
+      <w:r>
+        <w:t>&lt;{</w:t>
+      </w:r>
+      <w:proofErr w:type="spellStart"/>
+      <w:proofErr w:type="gramEnd"/>
+      <w:r>
+        <w:t>rendimiento_total</w:t>
+      </w:r>
+      <w:proofErr w:type="spellEnd"/>
+      <w:r>
+        <w:t xml:space="preserve">: 0.00000000}&gt;, # </w:t>
+      </w:r>
+      <w:proofErr w:type="spellStart"/>
+      <w:r>
+        <w:t>utilidad_con_comision</w:t>
+      </w:r>
+      <w:proofErr w:type="spellEnd"/>
+      <w:r>
+        <w:t xml:space="preserve"> / Capital invertido * 100</w:t>
+      </w:r>
+    </w:p>
+    <w:p>
+      <w:pPr>
+        <w:spacing w:after="0" w:line="240" w:lineRule="auto"/>
+      </w:pPr>
+      <w:proofErr w:type="gramStart"/>
+      <w:r>
+        <w:t>&lt;{</w:t>
+      </w:r>
+      <w:proofErr w:type="spellStart"/>
+      <w:proofErr w:type="gramEnd"/>
+      <w:r>
+        <w:t>dias_transcurridos</w:t>
+      </w:r>
+      <w:proofErr w:type="spellEnd"/>
+      <w:r>
+        <w:t>: 0.00}&gt;, #fecha compra de la nota de crédito más antigua de las escogidas</w:t>
+      </w:r>
+    </w:p>
+    <w:p>
+      <w:pPr>
+        <w:spacing w:after="0" w:line="240" w:lineRule="auto"/>
+      </w:pPr>
+      <w:proofErr w:type="gramStart"/>
+      <w:r>
+        <w:t>&lt;{</w:t>
+      </w:r>
+      <w:proofErr w:type="spellStart"/>
+      <w:proofErr w:type="gramEnd"/>
+      <w:r>
+        <w:t>roi</w:t>
+      </w:r>
+      <w:proofErr w:type="spellEnd"/>
+      <w:r>
+        <w:t xml:space="preserve">: 0.00000000}&gt;, # aplicar la formula del </w:t>
+      </w:r>
+      <w:proofErr w:type="spellStart"/>
+      <w:r>
+        <w:t>roi</w:t>
+      </w:r>
+      <w:proofErr w:type="spellEnd"/>
+    </w:p>
+    <w:p>
+      <w:pPr>
+        <w:spacing w:after="0" w:line="240" w:lineRule="auto"/>
+      </w:pPr>
+      <w:proofErr w:type="gramStart"/>
+      <w:r>
+        <w:t>&lt;{</w:t>
+      </w:r>
+      <w:proofErr w:type="spellStart"/>
+      <w:proofErr w:type="gramEnd"/>
+      <w:r>
+        <w:t>ganancia_anual</w:t>
+      </w:r>
+      <w:proofErr w:type="spellEnd"/>
+      <w:r>
+        <w:t xml:space="preserve">: 0.00000000}&gt;, #Calcular el porcentaje </w:t>
+      </w:r>
+    </w:p>
+    <w:p>
+      <w:pPr>
+        <w:spacing w:after="0" w:line="240" w:lineRule="auto"/>
+      </w:pPr>
+      <w:proofErr w:type="gramStart"/>
+      <w:r>
+        <w:t>&lt;{</w:t>
+      </w:r>
+      <w:proofErr w:type="spellStart"/>
+      <w:proofErr w:type="gramEnd"/>
+      <w:r>
+        <w:t>comisiones_santa_fe</w:t>
+      </w:r>
+      <w:proofErr w:type="spellEnd"/>
+      <w:r>
+        <w:t xml:space="preserve">: 0.00}&gt;, #sumatoria de todas las comisiones del operador de las notas de </w:t>
+      </w:r>
+      <w:proofErr w:type="spellStart"/>
+      <w:r>
+        <w:t>credito</w:t>
+      </w:r>
+      <w:proofErr w:type="spellEnd"/>
+      <w:r>
+        <w:t xml:space="preserve"> vendidas + </w:t>
+      </w:r>
+      <w:proofErr w:type="spellStart"/>
+      <w:r>
+        <w:t>comision</w:t>
+      </w:r>
+      <w:proofErr w:type="spellEnd"/>
+      <w:r>
+        <w:t xml:space="preserve"> del operador a la venta</w:t>
+      </w:r>
+    </w:p>
+    <w:p>
+      <w:pPr>
+        <w:spacing w:after="0" w:line="240" w:lineRule="auto"/>
+      </w:pPr>
+      <w:proofErr w:type="gramStart"/>
+      <w:r>
+        <w:t>&lt;{</w:t>
+      </w:r>
+      <w:proofErr w:type="gramEnd"/>
+      <w:r>
+        <w:t>retenciones: 0.00}&gt;, #0</w:t>
+      </w:r>
+    </w:p>
+    <w:p>
+      <w:pPr>
+        <w:spacing w:after="0" w:line="240" w:lineRule="auto"/>
+      </w:pPr>
+      <w:proofErr w:type="gramStart"/>
+      <w:r>
+        <w:t>&lt;{</w:t>
+      </w:r>
+      <w:proofErr w:type="spellStart"/>
+      <w:proofErr w:type="gramEnd"/>
+      <w:r>
+        <w:t>observacion</w:t>
+      </w:r>
+      <w:proofErr w:type="spellEnd"/>
+      <w:r>
+        <w:t>: }&gt;, #observacion ingresada en la pantalla "Venta Agrupada de Notas de Crédito”</w:t>
+      </w:r>
+    </w:p>
+    <w:p>
+      <w:pPr>
+        <w:spacing w:after="0" w:line="240" w:lineRule="auto"/>
+      </w:pPr>
+      <w:proofErr w:type="gramStart"/>
+      <w:r>
+        <w:t>&lt;{</w:t>
+      </w:r>
+      <w:proofErr w:type="gramEnd"/>
+      <w:r>
+        <w:t>activo: 1}&gt;, #1</w:t>
+      </w:r>
+    </w:p>
+    <w:p>
+      <w:pPr>
+        <w:spacing w:after="0" w:line="240" w:lineRule="auto"/>
+      </w:pPr>
+      <w:proofErr w:type="gramStart"/>
+      <w:r>
+        <w:t>&lt;{</w:t>
+      </w:r>
+      <w:proofErr w:type="gramEnd"/>
+      <w:r>
+        <w:t>eliminado: 0}&gt;, #0</w:t>
+      </w:r>
+    </w:p>
+    <w:p>
+      <w:pPr>
+        <w:spacing w:after="0" w:line="240" w:lineRule="auto"/>
+      </w:pPr>
+      <w:proofErr w:type="gramStart"/>
+      <w:r>
+        <w:t>&lt;{</w:t>
+      </w:r>
+      <w:proofErr w:type="spellStart"/>
+      <w:proofErr w:type="gramEnd"/>
+      <w:r>
+        <w:t>fecha_creacion</w:t>
+      </w:r>
+      <w:proofErr w:type="spellEnd"/>
+      <w:r>
+        <w:t xml:space="preserve">: </w:t>
+      </w:r>
+      <w:proofErr w:type="spellStart"/>
+      <w:r>
+        <w:t>current_timestamp</w:t>
+      </w:r>
+      <w:proofErr w:type="spellEnd"/>
+      <w:r>
+        <w:t>()}&gt;,</w:t>
+      </w:r>
+    </w:p>
+    <w:p>
+      <w:pPr>
+        <w:spacing w:after="0" w:line="240" w:lineRule="auto"/>
+      </w:pPr>
+      <w:proofErr w:type="gramStart"/>
+      <w:r>
+        <w:t>&lt;{</w:t>
+      </w:r>
+      <w:proofErr w:type="spellStart"/>
+      <w:proofErr w:type="gramEnd"/>
+      <w:r>
+        <w:t>fecha_actualizacion</w:t>
+      </w:r>
+      <w:proofErr w:type="spellEnd"/>
+      <w:r>
+        <w:t xml:space="preserve">: </w:t>
+      </w:r>
+      <w:proofErr w:type="spellStart"/>
+      <w:r>
+        <w:t>current_timestamp</w:t>
+      </w:r>
+      <w:proofErr w:type="spellEnd"/>
+      <w:r>
+        <w:t>()}&gt;);</w:t>
       </w:r>
     </w:p>
     <w:p>

</xml_diff>